<commit_message>
K-12 educational outcomes citizen-v2.0: viability-ordered tone/format revision
Co-authored-by: CaptainWrechols <CaptainWrechols@users.noreply.github.com>
</commit_message>
<xml_diff>
--- a/briefs/nevada/k-12_educational_outcomes/citizen-v2/citizen-brief.docx
+++ b/briefs/nevada/k-12_educational_outcomes/citizen-v2/citizen-brief.docx
@@ -50,12 +50,12 @@
           <w:color w:val="444444"/>
           <w:sz w:val="17"/>
         </w:rPr>
-        <w:t>The legislative record behind Nevadans' ten most common K-12 education proposals, 2019–2025.</w:t>
+        <w:t>The legislative record behind Nevadans' ten most common K-12 education proposals, 2019–2025 — organized by how far each idea has traveled toward law.</w:t>
       </w:r>
     </w:p>
     <w:p>
       <w:pPr>
-        <w:spacing w:before="120" w:after="60" w:lineRule="auto" w:line="254"/>
+        <w:spacing w:before="100" w:after="50" w:lineRule="auto" w:line="254"/>
       </w:pPr>
       <w:r>
         <w:rPr>
@@ -65,12 +65,12 @@
           <w:sz w:val="21"/>
           <w:spacing w:val="20"/>
         </w:rPr>
-        <w:t>THE LEGISLATIVE LANDSCAPE</w:t>
+        <w:t>WHAT THIS BRIEF COVERS AND HOW IT IS ORGANIZED</w:t>
       </w:r>
     </w:p>
     <w:p>
       <w:pPr>
-        <w:spacing w:before="0" w:after="80" w:lineRule="auto" w:line="254"/>
+        <w:spacing w:before="0" w:after="64" w:lineRule="auto" w:line="250"/>
         <w:jc w:val="both"/>
       </w:pPr>
       <w:r>
@@ -78,14 +78,14 @@
           <w:rFonts w:ascii="Arial" w:hAnsi="Arial" w:cs="Arial" w:eastAsia="Arial"/>
           <w:b w:val="0"/>
           <w:color w:val="444444"/>
-          <w:sz w:val="18"/>
+          <w:sz w:val="17"/>
         </w:rPr>
-        <w:t>Education is the biggest subject in Nevada's Legislature and its most crowded funnel: 513 education bills across the 2019, 2021, 2023, and 2025 sessions, of which 228 became law. Most bills that fail never get started — 193 of the 269 failures died in their first committee, 127 of them inside an Education committee, and 40 in the money committees. The big structural fight of this record was settled early: the 2019 session replaced the Nevada Plan, the state's previous school funding formula, with the Pupil-Centered Funding Plan (SB543). What stalls now is different — oversight machinery, classroom-time mandates, and changes to what gets measured. And since 2023 the governor's desk has become a live stop: 13 education vetoes in 2023 and 2025 combined, concentrated on collective-bargaining, school-adjacent health, and library bills, while raises, audits, and funding acts were signed.</w:t>
+        <w:t>Education is the Legislature's biggest and most cross-party subject: 513 bills across the 2019, 2021, 2023, and 2025 sessions, 228 of them now law (see Key numbers for the cross-party count). The big structural fight settled early — SB543 (2019) replaced the Nevada Plan with the Pupil-Centered Funding Plan — and every session since has built on it. Raises, audits, funding acts, and licensure bills pass, usually near-unanimously, and get signed; what stalls is narrower — oversight machinery, classroom-time mandates, and changes to what gets measured, several within one vote of law. The sections below sort the record by distance traveled: bills that passed both chambers, then bills with a winning vote behind them, then settled law and its openings, then routes with no traction yet — with notes on momentum, federal overlap, and sponsors.</w:t>
       </w:r>
     </w:p>
     <w:p>
       <w:pPr>
-        <w:spacing w:before="120" w:after="60" w:lineRule="auto" w:line="254"/>
+        <w:spacing w:before="100" w:after="50" w:lineRule="auto" w:line="254"/>
       </w:pPr>
       <w:r>
         <w:rPr>
@@ -95,7 +95,22 @@
           <w:sz w:val="21"/>
           <w:spacing w:val="20"/>
         </w:rPr>
-        <w:t>KEY NUMBERS</w:t>
+        <w:t>KEY NUMBERS: HOW FAR EDUCATION PROPOSALS HAVE TRAVELED</w:t>
+      </w:r>
+    </w:p>
+    <w:p>
+      <w:pPr>
+        <w:spacing w:before="0" w:after="60" w:lineRule="auto" w:line="254"/>
+      </w:pPr>
+      <w:r>
+        <w:rPr>
+          <w:rFonts w:ascii="Arial" w:hAnsi="Arial" w:cs="Arial" w:eastAsia="Arial"/>
+          <w:b w:val="0"/>
+          <w:i/>
+          <w:color w:val="666666"/>
+          <w:sz w:val="16"/>
+        </w:rPr>
+        <w:t>Each figure below is unpacked, bill by bill, in the section it points to.</w:t>
       </w:r>
     </w:p>
     <w:tbl>
@@ -154,7 +169,7 @@
                 <w:color w:val="666666"/>
                 <w:sz w:val="13"/>
               </w:rPr>
-              <w:t>education bills, 2019–2025</w:t>
+              <w:t>education bills taken up, 2019–2025</w:t>
             </w:r>
           </w:p>
         </w:tc>
@@ -228,9 +243,9 @@
                 <w:rFonts w:ascii="Arial" w:hAnsi="Arial" w:cs="Arial" w:eastAsia="Arial"/>
                 <w:b/>
                 <w:color w:val="1A2D4F"/>
-                <w:sz w:val="30"/>
+                <w:sz w:val="23"/>
               </w:rPr>
-              <w:t>193</w:t>
+              <w:t>40–0 / 21–0</w:t>
             </w:r>
           </w:p>
           <w:p>
@@ -244,7 +259,7 @@
                 <w:color w:val="666666"/>
                 <w:sz w:val="13"/>
               </w:rPr>
-              <w:t>died in their first committee</w:t>
+              <w:t>the floor votes on AB386 (2025), the literacy-assessment pilot that died awaiting one final concurrence vote</w:t>
             </w:r>
           </w:p>
         </w:tc>
@@ -275,7 +290,7 @@
                 <w:color w:val="1A2D4F"/>
                 <w:sz w:val="30"/>
               </w:rPr>
-              <w:t>13</w:t>
+              <w:t>55</w:t>
             </w:r>
           </w:p>
           <w:p>
@@ -289,7 +304,7 @@
                 <w:color w:val="666666"/>
                 <w:sz w:val="13"/>
               </w:rPr>
-              <w:t>vetoes — all in 2023 and 2025</w:t>
+              <w:t>bills carried sponsors from both parties — 28 became law</w:t>
             </w:r>
           </w:p>
         </w:tc>
@@ -334,7 +349,7 @@
                 <w:color w:val="666666"/>
                 <w:sz w:val="13"/>
               </w:rPr>
-              <w:t>independent-audit bills filed; none ever got a vote</w:t>
+              <w:t>outside-audit bills filed; none has yet received a vote</w:t>
             </w:r>
           </w:p>
         </w:tc>
@@ -347,7 +362,7 @@
     </w:p>
     <w:p>
       <w:pPr>
-        <w:spacing w:before="120" w:after="60" w:lineRule="auto" w:line="254"/>
+        <w:spacing w:before="100" w:after="50" w:lineRule="auto" w:line="254"/>
       </w:pPr>
       <w:r>
         <w:rPr>
@@ -357,12 +372,41 @@
           <w:sz w:val="21"/>
           <w:spacing w:val="20"/>
         </w:rPr>
-        <w:t>PROPOSALS WITH NO BILL ON RECORD</w:t>
+        <w:t>CLOSEST TO LAW: BILLS THAT PASSED BOTH CHAMBERS AND STOPPED AT THE LAST STEP</w:t>
       </w:r>
     </w:p>
     <w:p>
       <w:pPr>
-        <w:spacing w:before="0" w:after="80" w:lineRule="auto" w:line="254"/>
+        <w:spacing w:before="0" w:after="50" w:lineRule="auto" w:line="250"/>
+      </w:pPr>
+      <w:r>
+        <w:rPr>
+          <w:rFonts w:ascii="Arial" w:hAnsi="Arial" w:cs="Arial" w:eastAsia="Arial"/>
+          <w:b w:val="0"/>
+          <w:i/>
+          <w:color w:val="666666"/>
+          <w:sz w:val="15"/>
+        </w:rPr>
+        <w:t>These bills assembled majorities in both houses; only a veto or the session clock separated them from statute — the record's most advanced unfinished work.</w:t>
+      </w:r>
+    </w:p>
+    <w:p>
+      <w:pPr>
+        <w:spacing w:before="70" w:after="30" w:lineRule="auto" w:line="250"/>
+      </w:pPr>
+      <w:r>
+        <w:rPr>
+          <w:rFonts w:ascii="Arial" w:hAnsi="Arial" w:cs="Arial" w:eastAsia="Arial"/>
+          <w:b/>
+          <w:color w:val="2E4A78"/>
+          <w:sz w:val="18"/>
+        </w:rPr>
+        <w:t>Passed both chambers, lost to the clock</w:t>
+      </w:r>
+    </w:p>
+    <w:p>
+      <w:pPr>
+        <w:spacing w:before="0" w:after="64" w:lineRule="auto" w:line="250"/>
         <w:jc w:val="both"/>
       </w:pPr>
       <w:r>
@@ -370,23 +414,106 @@
           <w:rFonts w:ascii="Arial" w:hAnsi="Arial" w:cs="Arial" w:eastAsia="Arial"/>
           <w:b/>
           <w:color w:val="1A2D4F"/>
-          <w:sz w:val="18"/>
+          <w:sz w:val="17"/>
         </w:rPr>
-        <w:t>Evidence-based classroom technology.</w:t>
+        <w:t>An alternative Read by Grade 3 assessment — AB386 (2025).</w:t>
       </w:r>
       <w:r>
         <w:rPr>
           <w:rFonts w:ascii="Arial" w:hAnsi="Arial" w:cs="Arial" w:eastAsia="Arial"/>
           <w:b w:val="0"/>
           <w:color w:val="444444"/>
-          <w:sz w:val="18"/>
+          <w:sz w:val="17"/>
         </w:rPr>
-        <w:t xml:space="preserve"> No bill in this record requires independent proof of learning benefit before districts buy instructional technology, and none limits classroom screen time for young pupils. The Legislature regulates the edges instead: schools must disclose which online services receive pupil data (SB403, 2019, 40–0 and 21–0), districts are required to adopt cellphone policies with instructional-time limits (SB444, 2025, 42–0 and 21–0), and artificial intelligence cannot perform school counselors' mental-health work (AB406, 2025). The state's dedicated ed-tech commission was abolished in 2023 (SB214). A purchasing standard would be new statutory ground — and the 2025 bill nearest to transparency about classroom materials, SB248, died in Senate Education.</w:t>
+        <w:t xml:space="preserve"> Let Washoe County pilot an alternative literacy assessment; passed the Assembly 40–0 and the Senate 21–0 as amended, then died awaiting a final concurrence vote at session's end. Two unanimous chambers make it the record's most advanced unfinished education bill.</w:t>
       </w:r>
     </w:p>
     <w:p>
       <w:pPr>
-        <w:spacing w:before="120" w:after="60" w:lineRule="auto" w:line="254"/>
+        <w:spacing w:before="70" w:after="30" w:lineRule="auto" w:line="250"/>
+      </w:pPr>
+      <w:r>
+        <w:rPr>
+          <w:rFonts w:ascii="Arial" w:hAnsi="Arial" w:cs="Arial" w:eastAsia="Arial"/>
+          <w:b/>
+          <w:color w:val="2E4A78"/>
+          <w:sz w:val="18"/>
+        </w:rPr>
+        <w:t>Vetoed at the governor's desk</w:t>
+      </w:r>
+    </w:p>
+    <w:p>
+      <w:pPr>
+        <w:spacing w:before="0" w:after="64" w:lineRule="auto" w:line="250"/>
+        <w:jc w:val="both"/>
+      </w:pPr>
+      <w:r>
+        <w:rPr>
+          <w:rFonts w:ascii="Arial" w:hAnsi="Arial" w:cs="Arial" w:eastAsia="Arial"/>
+          <w:b w:val="0"/>
+          <w:color w:val="444444"/>
+          <w:sz w:val="17"/>
+        </w:rPr>
+        <w:t xml:space="preserve">All 13 education vetoes fall in 2023 and 2025 and attach to specific designs: </w:t>
+      </w:r>
+      <w:r>
+        <w:rPr>
+          <w:rFonts w:ascii="Arial" w:hAnsi="Arial" w:cs="Arial" w:eastAsia="Arial"/>
+          <w:b/>
+          <w:color w:val="1A2D4F"/>
+          <w:sz w:val="17"/>
+        </w:rPr>
+        <w:t>the statewide children's mental-health consortium (AB265, 2023)</w:t>
+      </w:r>
+      <w:r>
+        <w:rPr>
+          <w:rFonts w:ascii="Arial" w:hAnsi="Arial" w:cs="Arial" w:eastAsia="Arial"/>
+          <w:b w:val="0"/>
+          <w:color w:val="444444"/>
+          <w:sz w:val="17"/>
+        </w:rPr>
+        <w:t xml:space="preserve">, vetoed after passing 42–0 and 20–0; </w:t>
+      </w:r>
+      <w:r>
+        <w:rPr>
+          <w:rFonts w:ascii="Arial" w:hAnsi="Arial" w:cs="Arial" w:eastAsia="Arial"/>
+          <w:b/>
+          <w:color w:val="1A2D4F"/>
+          <w:sz w:val="17"/>
+        </w:rPr>
+        <w:t>the substitute-teacher insurance subsidy (AB282, 2023)</w:t>
+      </w:r>
+      <w:r>
+        <w:rPr>
+          <w:rFonts w:ascii="Arial" w:hAnsi="Arial" w:cs="Arial" w:eastAsia="Arial"/>
+          <w:b w:val="0"/>
+          <w:color w:val="444444"/>
+          <w:sz w:val="17"/>
+        </w:rPr>
+        <w:t xml:space="preserve">, vetoed after 31–11 and 16–4; </w:t>
+      </w:r>
+      <w:r>
+        <w:rPr>
+          <w:rFonts w:ascii="Arial" w:hAnsi="Arial" w:cs="Arial" w:eastAsia="Arial"/>
+          <w:b/>
+          <w:color w:val="1A2D4F"/>
+          <w:sz w:val="17"/>
+        </w:rPr>
+        <w:t>class-size collective bargaining (AB155, 2025)</w:t>
+      </w:r>
+      <w:r>
+        <w:rPr>
+          <w:rFonts w:ascii="Arial" w:hAnsi="Arial" w:cs="Arial" w:eastAsia="Arial"/>
+          <w:b w:val="0"/>
+          <w:color w:val="444444"/>
+          <w:sz w:val="17"/>
+        </w:rPr>
+        <w:t>. Collective-bargaining, school-adjacent health, and library bills stop at the desk — several with proven majorities, one unanimous — while raises, audits, and funding acts are signed.</w:t>
+      </w:r>
+    </w:p>
+    <w:p>
+      <w:pPr>
+        <w:spacing w:before="100" w:after="50" w:lineRule="auto" w:line="254"/>
       </w:pPr>
       <w:r>
         <w:rPr>
@@ -396,12 +523,27 @@
           <w:sz w:val="21"/>
           <w:spacing w:val="20"/>
         </w:rPr>
-        <w:t>PROPOSALS THAT REACHED THE LEGISLATURE AND STALLED</w:t>
+        <w:t>DEMONSTRATED SUPPORT: BILLS THAT CLEARED ONE CHAMBER OR A COMMITTEE</w:t>
       </w:r>
     </w:p>
     <w:p>
       <w:pPr>
-        <w:spacing w:before="0" w:after="80" w:lineRule="auto" w:line="254"/>
+        <w:spacing w:before="0" w:after="50" w:lineRule="auto" w:line="250"/>
+      </w:pPr>
+      <w:r>
+        <w:rPr>
+          <w:rFonts w:ascii="Arial" w:hAnsi="Arial" w:cs="Arial" w:eastAsia="Arial"/>
+          <w:b w:val="0"/>
+          <w:i/>
+          <w:color w:val="666666"/>
+          <w:sz w:val="15"/>
+        </w:rPr>
+        <w:t>Each bill here won a recorded majority — in committee or on a floor — before stalling: the strongest signal short of passage.</w:t>
+      </w:r>
+    </w:p>
+    <w:p>
+      <w:pPr>
+        <w:spacing w:before="0" w:after="64" w:lineRule="auto" w:line="250"/>
         <w:jc w:val="both"/>
       </w:pPr>
       <w:r>
@@ -409,23 +551,23 @@
           <w:rFonts w:ascii="Arial" w:hAnsi="Arial" w:cs="Arial" w:eastAsia="Arial"/>
           <w:b/>
           <w:color w:val="1A2D4F"/>
-          <w:sz w:val="18"/>
+          <w:sz w:val="17"/>
         </w:rPr>
-        <w:t>An outside audit of school spending.</w:t>
+        <w:t>Measurement bills that won votes.</w:t>
       </w:r>
       <w:r>
         <w:rPr>
           <w:rFonts w:ascii="Arial" w:hAnsi="Arial" w:cs="Arial" w:eastAsia="Arial"/>
           <w:b w:val="0"/>
           <w:color w:val="444444"/>
-          <w:sz w:val="18"/>
+          <w:sz w:val="17"/>
         </w:rPr>
-        <w:t xml:space="preserve"> The independent inspector-general design has been filed seven times in four sessions and has never received a vote: AB146 and AB296 (2019), AB108 (2021), AB149 — an Inspector General of Education — and AB353 (2023), AB33 and AB154 (2025). Assemblymember Brittney Miller (D) carried it four sessions running; a Republican version died the same way. A Financial Oversight of School Spending Committee (AB395, 2023) also died in committee. What passed keeps auditing inside government: AB517 (2023) orders recurring legislative performance audits of the two biggest districts and the charter authority, 42–0 and 21–0, with the first audits due in 2026, and existing law already requires six-year outside-consultant financial reviews of districts — a 2025 bill to repeal those reviews failed too.</w:t>
+        <w:t xml:space="preserve"> Competency-based education expansion (SB403, 2025) passed the Senate 21–0 and died in the second house. The social-emotional measurement bills, SB313 (2023) and SB314 (2025), cleared committee both times — carried by Senator Roberta Lange (D) with Senator Lisa Krasner (R), both still serving — and died on the Senate floor twice, never on a recorded vote against them.</w:t>
       </w:r>
     </w:p>
     <w:p>
       <w:pPr>
-        <w:spacing w:before="0" w:after="80" w:lineRule="auto" w:line="254"/>
+        <w:spacing w:before="0" w:after="64" w:lineRule="auto" w:line="250"/>
         <w:jc w:val="both"/>
       </w:pPr>
       <w:r>
@@ -433,71 +575,23 @@
           <w:rFonts w:ascii="Arial" w:hAnsi="Arial" w:cs="Arial" w:eastAsia="Arial"/>
           <w:b/>
           <w:color w:val="1A2D4F"/>
-          <w:sz w:val="18"/>
+          <w:sz w:val="17"/>
         </w:rPr>
-        <w:t>Recess and guaranteed instructional minutes.</w:t>
+        <w:t>Full rights for appointed trustees — 2025.</w:t>
       </w:r>
       <w:r>
         <w:rPr>
           <w:rFonts w:ascii="Arial" w:hAnsi="Arial" w:cs="Arial" w:eastAsia="Arial"/>
           <w:b w:val="0"/>
           <w:color w:val="444444"/>
-          <w:sz w:val="18"/>
+          <w:sz w:val="17"/>
         </w:rPr>
-        <w:t xml:space="preserve"> The recess mandate reached the Legislature once: AB53 (2025) would have required at least 20 minutes of daily outdoor recess in kindergarten through grade 5 and banned withholding recess for academic or behavioral reasons — the exact enforcement gap participants described. It died in Assembly Education without a vote. A PE-content bill (SB182, 2021) and a fourth social-studies credit (AB228, 2023) also stalled. The contrast: when leadership wants a content mandate, it passes nearly unanimously — financial-literacy credits (AB274, 2023, 40–0 and 20–0) and the cellphone rules of 2025.</w:t>
+        <w:t xml:space="preserve"> The upgrade of AB175's four appointed nonvoting Clark County trustees to full voting rights with term limits passed the Assembly 24–18 and died in Senate Education. The base law, AB175 (2023), had passed 29–11 and 16–4 after appointed-seat bills died in committee in 2019, 2021, and 2023 — the idea has moved further each cycle.</w:t>
       </w:r>
     </w:p>
     <w:p>
       <w:pPr>
-        <w:spacing w:before="0" w:after="80" w:lineRule="auto" w:line="254"/>
-        <w:jc w:val="both"/>
-      </w:pPr>
-      <w:r>
-        <w:rPr>
-          <w:rFonts w:ascii="Arial" w:hAnsi="Arial" w:cs="Arial" w:eastAsia="Arial"/>
-          <w:b/>
-          <w:color w:val="1A2D4F"/>
-          <w:sz w:val="18"/>
-        </w:rPr>
-        <w:t>Measuring growth instead of fixed proficiency.</w:t>
-      </w:r>
-      <w:r>
-        <w:rPr>
-          <w:rFonts w:ascii="Arial" w:hAnsi="Arial" w:cs="Arial" w:eastAsia="Arial"/>
-          <w:b w:val="0"/>
-          <w:color w:val="444444"/>
-          <w:sz w:val="18"/>
-        </w:rPr>
-        <w:t xml:space="preserve"> The purest "measure the delta" bill, SB351 (2025), would have double-weighted the growth of the lowest-scoring pupils in school star ratings; it died in Senate Education without a vote. The social-emotional measurement bill cleared committee and died on the Senate floor twice — SB313 (2023, carried by Sen. Roberta Lange (D) with Sen. Lisa Krasner (R)) and SB314 (2025). Competency-based education expansion passed the Senate 21–0 and died in the second house (SB403, 2025). What passed trims testing rather than redesigning it: a cap on class time spent on tests (SB353, 2021, 42–0 and 21–0) and the end of end-of-course finals (SB9, 2023). Nevada's ratings already include a growth component; the failed bills changed its weight, not its existence.</w:t>
-      </w:r>
-    </w:p>
-    <w:p>
-      <w:pPr>
-        <w:spacing w:before="0" w:after="80" w:lineRule="auto" w:line="254"/>
-        <w:jc w:val="both"/>
-      </w:pPr>
-      <w:r>
-        <w:rPr>
-          <w:rFonts w:ascii="Arial" w:hAnsi="Arial" w:cs="Arial" w:eastAsia="Arial"/>
-          <w:b/>
-          <w:color w:val="1A2D4F"/>
-          <w:sz w:val="18"/>
-        </w:rPr>
-        <w:t>Read by Grade 3 reform.</w:t>
-      </w:r>
-      <w:r>
-        <w:rPr>
-          <w:rFonts w:ascii="Arial" w:hAnsi="Arial" w:cs="Arial" w:eastAsia="Arial"/>
-          <w:b w:val="0"/>
-          <w:color w:val="444444"/>
-          <w:sz w:val="18"/>
-        </w:rPr>
-        <w:t xml:space="preserve"> The record confirms what participants remembered: AB289 (2019) removed automatic third-grade retention and substituted mandatory intensive reading help, 28–11 and 17–4 — and no bill since has proposed reinstating retention. No bill repeals the assessment requirement either. The nearest attempt, AB386 (2025), let Washoe County pilot an alternative literacy assessment; it passed the Assembly 40–0 and the Senate 21–0 as amended, then died awaiting a final concurrence vote when the session ended. What did pass narrows the machinery — SB278 (2025) made the statewide assessment the sole trigger for deficiency decisions (42–0, 21–0). The phonics-side bill, a ban on three-cueing reading instruction (AB187, 2023), died in committee. In the 2020 special session, the COVID budget act cut the program's $31.4 million second-year transfer and listed it among the first accounts to restore.</w:t>
-      </w:r>
-    </w:p>
-    <w:p>
-      <w:pPr>
-        <w:spacing w:before="120" w:after="60" w:lineRule="auto" w:line="254"/>
+        <w:spacing w:before="100" w:after="50" w:lineRule="auto" w:line="254"/>
       </w:pPr>
       <w:r>
         <w:rPr>
@@ -507,132 +601,85 @@
           <w:sz w:val="21"/>
           <w:spacing w:val="20"/>
         </w:rPr>
-        <w:t>WHERE PRECEDENT EXISTS</w:t>
+        <w:t>ALREADY LAW — AND THE OPENINGS AROUND IT</w:t>
       </w:r>
     </w:p>
     <w:p>
       <w:pPr>
-        <w:spacing w:before="0" w:after="80" w:lineRule="auto" w:line="254"/>
+        <w:spacing w:before="0" w:after="50" w:lineRule="auto" w:line="250"/>
+      </w:pPr>
+      <w:r>
+        <w:rPr>
+          <w:rFonts w:ascii="Arial" w:hAnsi="Arial" w:cs="Arial" w:eastAsia="Arial"/>
+          <w:b w:val="0"/>
+          <w:i/>
+          <w:color w:val="666666"/>
+          <w:sz w:val="15"/>
+        </w:rPr>
+        <w:t>Fresh statutes mark ground unlikely to be revisited soon — and the lanes where the Legislature keeps building.</w:t>
+      </w:r>
+    </w:p>
+    <w:p>
+      <w:pPr>
+        <w:spacing w:before="70" w:after="30" w:lineRule="auto" w:line="250"/>
+      </w:pPr>
+      <w:r>
+        <w:rPr>
+          <w:rFonts w:ascii="Arial" w:hAnsi="Arial" w:cs="Arial" w:eastAsia="Arial"/>
+          <w:b/>
+          <w:color w:val="2E4A78"/>
+          <w:sz w:val="18"/>
+        </w:rPr>
+        <w:t>Recently settled ground (2025 session)</w:t>
+      </w:r>
+    </w:p>
+    <w:p>
+      <w:pPr>
+        <w:spacing w:before="0" w:after="64" w:lineRule="auto" w:line="250"/>
         <w:jc w:val="both"/>
       </w:pPr>
       <w:r>
         <w:rPr>
           <w:rFonts w:ascii="Arial" w:hAnsi="Arial" w:cs="Arial" w:eastAsia="Arial"/>
+          <w:b w:val="0"/>
+          <w:color w:val="444444"/>
+          <w:sz w:val="17"/>
+        </w:rPr>
+        <w:t>The 2025 session funded extra pay for hard-to-fill positions (AB398, 20–0 and 41–1), let out-of-state teachers start work provisionally (AB49, 42–0 and 21–0), created principal consequences and a Public Education Oversight Board (SB460, 21–0 and 38–4), made the statewide assessment the sole Read by Grade 3 trigger (SB278, 42–0 and 21–0), required district cellphone policies (SB444, 42–0 and 21–0), banned AI from counselor duties (AB406), added school social workers where money allows (SB277, 38–1 and 15–5), bonded $100 million for emergency school repairs (AB224, 41–1 and 21–0), opened cross-zone transfers with transportation grants (AB533), and passed the biennium funding act (SB500, 42–0 and 13–8). Bills restating these would duplicate just-completed work and are unlikely to advance.</w:t>
+      </w:r>
+    </w:p>
+    <w:p>
+      <w:pPr>
+        <w:spacing w:before="70" w:after="30" w:lineRule="auto" w:line="250"/>
+      </w:pPr>
+      <w:r>
+        <w:rPr>
+          <w:rFonts w:ascii="Arial" w:hAnsi="Arial" w:cs="Arial" w:eastAsia="Arial"/>
           <w:b/>
-          <w:color w:val="1A2D4F"/>
+          <w:color w:val="2E4A78"/>
           <w:sz w:val="18"/>
         </w:rPr>
-        <w:t>Per-pupil funding.</w:t>
+        <w:t>Where the record points further</w:t>
       </w:r>
+    </w:p>
+    <w:p>
+      <w:pPr>
+        <w:spacing w:before="0" w:after="64" w:lineRule="auto" w:line="250"/>
+        <w:jc w:val="both"/>
+      </w:pPr>
       <w:r>
         <w:rPr>
           <w:rFonts w:ascii="Arial" w:hAnsi="Arial" w:cs="Arial" w:eastAsia="Arial"/>
           <w:b w:val="0"/>
           <w:color w:val="444444"/>
-          <w:sz w:val="18"/>
+          <w:sz w:val="17"/>
         </w:rPr>
-        <w:t xml:space="preserve"> The machinery was rebuilt inside this record: SB543 (2019) created the State Education Fund and the per-pupil formula (18–3, 34–7); SB439 (2021) rebuilt its revenue streams; AB495 (2021) added a gold-and-silver mining tax routed to education (28–14, 16–5); SB503 (2023) and SB500 (2025, 42–0 and 13–8) are the biennium funding acts, and SB231 (2023) funded raises in districts that budget them (21–0, 41–1). No bill sets a national-average target, and the guarantee keeps dying: AB459 (2023), requiring the education budget to at least keep pace with inflation plus enrollment, died in Ways and Means, as did its 2025 successor in Finance. The standing Commission on School Funding is the body in statute charged with calculating what full funding would take.</w:t>
+        <w:t>The accountability lane is widening, not closing: AB517 (2023) ordered recurring legislative performance audits of the two biggest districts and the charter authority, 42–0 and 21–0, first audits due in 2026, and SB460's new oversight board gives future accountability proposals a statutory home. Principal accountability is law twice over (SB292 of 2023, 21–0 and 39–3; SB460). Nevada's ratings already include a growth component — the failed bills changed its weight, not its existence — and testing has been trimmed twice (SB353 of 2021, capping test time, 42–0 and 21–0; SB9 of 2023, ending end-of-course finals). The teacher pipeline keeps passing near-unanimously: the Interstate Teacher Mobility Compact (SB442, 2023), paid teaching-pathway grants (AB515, AB428, 2023), provisional hiring (AB49), raise funding (SB231 of 2023, 21–0 and 41–1). Pre-K investment is solid precedent — the state grant program (SB84, 2019, 41–0 and 20–0), the early-literacy account (AB400, 2023), family engagement extended in 2025 (AB212, 38–4 and 21–0) — with seats growing through the budget. The funding machinery itself was rebuilt inside this record: SB543 (2019, 18–3 and 34–7), SB439 (2021), the mining tax routed to education (AB495, 2021, 28–14 and 16–5), the biennium acts (SB503, SB500), and the statutory Commission on School Funding charged with calculating what full funding would take. AB289 (2019) removed automatic third-grade retention, 28–11 and 17–4 — no bill since has proposed reinstating it, and when the 2020 special session's COVID budget act cut the program's $31.4 million second-year transfer, it listed that money among the first accounts to restore.</w:t>
       </w:r>
     </w:p>
     <w:p>
       <w:pPr>
-        <w:spacing w:before="0" w:after="80" w:lineRule="auto" w:line="254"/>
-        <w:jc w:val="both"/>
-      </w:pPr>
-      <w:r>
-        <w:rPr>
-          <w:rFonts w:ascii="Arial" w:hAnsi="Arial" w:cs="Arial" w:eastAsia="Arial"/>
-          <w:b/>
-          <w:color w:val="1A2D4F"/>
-          <w:sz w:val="18"/>
-        </w:rPr>
-        <w:t>Universal pre-K and early childhood.</w:t>
-      </w:r>
-      <w:r>
-        <w:rPr>
-          <w:rFonts w:ascii="Arial" w:hAnsi="Arial" w:cs="Arial" w:eastAsia="Arial"/>
-          <w:b w:val="0"/>
-          <w:color w:val="444444"/>
-          <w:sz w:val="18"/>
-        </w:rPr>
-        <w:t xml:space="preserve"> No bill proposes pre-K for all children; the investment precedent is solid. SB84 (2019) put the state pre-K grant program in statute, 41–0 and 20–0; AB400 (2023) added an early-literacy account; family-engagement programs for children entering kindergarten passed in 2023 and were extended in 2025 (AB212, 38–4 and 21–0). The structural bills keep dying: statutory early-childhood offices failed on the Assembly floor in 2023 (AB113) and in committee in 2025 (SB82), and the 2025 bill widening pre-K grant eligibility and tying grant size to per-pupil funding (SB58) died in Senate Finance. Seats grow through the budget, not through an entitlement statute.</w:t>
-      </w:r>
-    </w:p>
-    <w:p>
-      <w:pPr>
-        <w:spacing w:before="0" w:after="80" w:lineRule="auto" w:line="254"/>
-        <w:jc w:val="both"/>
-      </w:pPr>
-      <w:r>
-        <w:rPr>
-          <w:rFonts w:ascii="Arial" w:hAnsi="Arial" w:cs="Arial" w:eastAsia="Arial"/>
-          <w:b/>
-          <w:color w:val="1A2D4F"/>
-          <w:sz w:val="18"/>
-        </w:rPr>
-        <w:t>Accountability for administrators.</w:t>
-      </w:r>
-      <w:r>
-        <w:rPr>
-          <w:rFonts w:ascii="Arial" w:hAnsi="Arial" w:cs="Arial" w:eastAsia="Arial"/>
-          <w:b w:val="0"/>
-          <w:color w:val="444444"/>
-          <w:sz w:val="18"/>
-        </w:rPr>
-        <w:t xml:space="preserve"> Principal accountability is law twice over: SB292 (2023) makes principals at-will employees when their school's rating falls and half the teachers ask to transfer (21–0, 39–3), and SB460 (2025) requires elementary achievement plans with consequences for principals and created a Public Education Oversight Board (21–0, 38–4). School-board restructuring keeps failing: appointed-seat bills died in committee in 2019, 2021, and 2023 before AB175 (2023) seated four appointed nonvoting Clark County trustees (29–11, 16–4); the 2025 upgrade giving them full rights and term limits passed the Assembly 24–18 and died in Senate Education. Superintendent pay — the $485,000 contracts participants described — has never been touched by a bill in this record; those contracts are signed by elected boards.</w:t>
-      </w:r>
-    </w:p>
-    <w:p>
-      <w:pPr>
-        <w:spacing w:before="0" w:after="80" w:lineRule="auto" w:line="254"/>
-        <w:jc w:val="both"/>
-      </w:pPr>
-      <w:r>
-        <w:rPr>
-          <w:rFonts w:ascii="Arial" w:hAnsi="Arial" w:cs="Arial" w:eastAsia="Arial"/>
-          <w:b/>
-          <w:color w:val="1A2D4F"/>
-          <w:sz w:val="18"/>
-        </w:rPr>
-        <w:t>Teacher pay and the shortage.</w:t>
-      </w:r>
-      <w:r>
-        <w:rPr>
-          <w:rFonts w:ascii="Arial" w:hAnsi="Arial" w:cs="Arial" w:eastAsia="Arial"/>
-          <w:b w:val="0"/>
-          <w:color w:val="444444"/>
-          <w:sz w:val="18"/>
-        </w:rPr>
-        <w:t xml:space="preserve"> Participants predicted lawmakers would say they "just raised teacher pay," and the record shows why: SB231 (2023) sent state money to districts budgeting raises for teachers and support staff, and AB398 (2025) funds extra pay for hard-to-fill positions (20–0, 41–1). The supply pipeline passed nearly unanimously — the Interstate Teacher Mobility Compact (SB442, 2023), paid teaching-pathway grants (AB515 and AB428, 2023), one-year provisional hiring of out-of-state teachers (AB49, 2025, 42–0 and 21–0). What failed or died: the $45,000 minimum salary (SB445, 2019, Republican-sponsored, died in committee), the 16-pupil grade-3 class-size cap (AB335, 2023), and — at the governor's desk — the substitute-teacher insurance subsidy (AB282, 2023, passed 31–11 and 16–4, vetoed) and class-size collective bargaining (AB155, 2025, vetoed).</w:t>
-      </w:r>
-    </w:p>
-    <w:p>
-      <w:pPr>
-        <w:spacing w:before="0" w:after="80" w:lineRule="auto" w:line="254"/>
-        <w:jc w:val="both"/>
-      </w:pPr>
-      <w:r>
-        <w:rPr>
-          <w:rFonts w:ascii="Arial" w:hAnsi="Arial" w:cs="Arial" w:eastAsia="Arial"/>
-          <w:b/>
-          <w:color w:val="1A2D4F"/>
-          <w:sz w:val="18"/>
-        </w:rPr>
-        <w:t>School-based mental health.</w:t>
-      </w:r>
-      <w:r>
-        <w:rPr>
-          <w:rFonts w:ascii="Arial" w:hAnsi="Arial" w:cs="Arial" w:eastAsia="Arial"/>
-          <w:b w:val="0"/>
-          <w:color w:val="444444"/>
-          <w:sz w:val="18"/>
-        </w:rPr>
-        <w:t xml:space="preserve"> The staffing framework exists: SB319 (2019) defined counselor, psychologist, and social-worker roles and requires a full-time counselor in every school "to the extent money is available" (41–0, 21–0); SB151 (2021) makes the two urban districts plan and report annually on improving support-staff ratios; SB277 (2025) does the same for social workers and eases their licensure (38–1, 15–5). The unconditional versions die: the bill deleting the money-permitting words (AB298, 2025) and the monthly mental-health workshop mandate (AB374, 2025) both died in committee. The governance layer hit the veto desk — the statewide children's mental-health consortium passed 42–0 and 20–0 and was vetoed (AB265, 2023).</w:t>
-      </w:r>
-    </w:p>
-    <w:p>
-      <w:pPr>
-        <w:spacing w:before="120" w:after="60" w:lineRule="auto" w:line="254"/>
+        <w:spacing w:before="100" w:after="50" w:lineRule="auto" w:line="254"/>
       </w:pPr>
       <w:r>
         <w:rPr>
@@ -642,27 +689,123 @@
           <w:sz w:val="21"/>
           <w:spacing w:val="20"/>
         </w:rPr>
-        <w:t>THE POLITICAL TERRAIN</w:t>
+        <w:t>ROUTES WITH LITTLE TRACTION YET: NEVER FILED, NEVER HEARD, OR STOPPED EARLY</w:t>
       </w:r>
     </w:p>
     <w:p>
       <w:pPr>
-        <w:spacing w:before="0" w:after="80" w:lineRule="auto" w:line="254"/>
+        <w:spacing w:before="0" w:after="50" w:lineRule="auto" w:line="250"/>
+      </w:pPr>
+      <w:r>
+        <w:rPr>
+          <w:rFonts w:ascii="Arial" w:hAnsi="Arial" w:cs="Arial" w:eastAsia="Arial"/>
+          <w:b w:val="0"/>
+          <w:i/>
+          <w:color w:val="666666"/>
+          <w:sz w:val="15"/>
+        </w:rPr>
+        <w:t>Nothing here has won a vote — never filed, never heard in committee, or stopped early. The least-traveled routes: unproven rather than closed.</w:t>
+      </w:r>
+    </w:p>
+    <w:p>
+      <w:pPr>
+        <w:spacing w:before="0" w:after="64" w:lineRule="auto" w:line="250"/>
         <w:jc w:val="both"/>
       </w:pPr>
       <w:r>
         <w:rPr>
           <w:rFonts w:ascii="Arial" w:hAnsi="Arial" w:cs="Arial" w:eastAsia="Arial"/>
+          <w:b/>
+          <w:color w:val="1A2D4F"/>
+          <w:sz w:val="17"/>
+        </w:rPr>
+        <w:t>An outside audit of school spending.</w:t>
+      </w:r>
+      <w:r>
+        <w:rPr>
+          <w:rFonts w:ascii="Arial" w:hAnsi="Arial" w:cs="Arial" w:eastAsia="Arial"/>
           <w:b w:val="0"/>
           <w:color w:val="444444"/>
-          <w:sz w:val="18"/>
+          <w:sz w:val="17"/>
         </w:rPr>
-        <w:t>Education is the Legislature's most cross-party subject in this record: 55 policy bills carried sponsors from both parties, and 28 of them became law. Senate Education Democrats and Republicans both carry heavy loads — Sen. Marilyn Dondero Loop (D) is the most frequent primary sponsor (37 bills), followed by Sen. Scott Hammond (R, 31, mostly choice bills that died in committee) and Sen. Carrie Buck (R, 31). Assemblymember Brittney Miller (D) owns the auditor file; Assemblymember Selena Torres-Fossett (D) the teacher pipeline. The chokepoints are stable: Education committees killed 127 bills at the first stop, the money committees 40 — mostly bills with price tags — and Government Affairs 12, including most inspector-general designs. Since 2023, bargaining and school-adjacent health bills pass on divided floor votes and stop at the governor's desk; money, audits, and licensure bills pass unanimously and get signed.</w:t>
+        <w:t xml:space="preserve"> Filed seven times in four sessions, never a vote: AB146 and AB296 (2019), AB108 (2021), AB149 — an Inspector General of Education — and AB353 (2023), AB33 and AB154 (2025), plus the oversight committee AB395 (2023). Assemblymember Brittney Miller (D), still serving, carried it four sessions running; a Republican version died the same way. The traction is inside government: AB517's unanimous audits, and the six-year outside-consultant reviews already in law — which a 2025 repeal bill failed to remove.</w:t>
       </w:r>
     </w:p>
     <w:p>
       <w:pPr>
-        <w:spacing w:before="120" w:after="60" w:lineRule="auto" w:line="254"/>
+        <w:spacing w:before="0" w:after="64" w:lineRule="auto" w:line="250"/>
+        <w:jc w:val="both"/>
+      </w:pPr>
+      <w:r>
+        <w:rPr>
+          <w:rFonts w:ascii="Arial" w:hAnsi="Arial" w:cs="Arial" w:eastAsia="Arial"/>
+          <w:b/>
+          <w:color w:val="1A2D4F"/>
+          <w:sz w:val="17"/>
+        </w:rPr>
+        <w:t>Recess and instructional minutes.</w:t>
+      </w:r>
+      <w:r>
+        <w:rPr>
+          <w:rFonts w:ascii="Arial" w:hAnsi="Arial" w:cs="Arial" w:eastAsia="Arial"/>
+          <w:b w:val="0"/>
+          <w:color w:val="444444"/>
+          <w:sz w:val="17"/>
+        </w:rPr>
+        <w:t xml:space="preserve"> AB53 (2025) — 20 minutes of daily outdoor recess in K-5 and a ban on withholding it — died in Assembly Education without a vote; the PE-content bill (SB182, 2021) and a fourth social-studies credit (AB228, 2023) also stalled. When leadership backs a content mandate it passes nearly unanimously (financial literacy, AB274 of 2023, 40–0 and 20–0; the 2025 cellphone rules).</w:t>
+      </w:r>
+    </w:p>
+    <w:p>
+      <w:pPr>
+        <w:spacing w:before="0" w:after="64" w:lineRule="auto" w:line="250"/>
+        <w:jc w:val="both"/>
+      </w:pPr>
+      <w:r>
+        <w:rPr>
+          <w:rFonts w:ascii="Arial" w:hAnsi="Arial" w:cs="Arial" w:eastAsia="Arial"/>
+          <w:b/>
+          <w:color w:val="1A2D4F"/>
+          <w:sz w:val="17"/>
+        </w:rPr>
+        <w:t>Growth-weighted ratings and the money guarantees.</w:t>
+      </w:r>
+      <w:r>
+        <w:rPr>
+          <w:rFonts w:ascii="Arial" w:hAnsi="Arial" w:cs="Arial" w:eastAsia="Arial"/>
+          <w:b w:val="0"/>
+          <w:color w:val="444444"/>
+          <w:sz w:val="17"/>
+        </w:rPr>
+        <w:t xml:space="preserve"> SB351 (2025), double-weighting the growth of the lowest-scoring pupils, died in Senate Education without a vote. AB459 (2023), requiring the education budget to keep pace with inflation plus enrollment, died in Ways and Means, as did its 2025 successor in Finance; SB58 (2025), widening pre-K grant eligibility, died in Senate Finance; the $45,000 minimum teacher salary (SB445, 2019, Republican-sponsored) and the grade-3 class-size cap (AB335, 2023) died in committee. Early-childhood offices failed on the Assembly floor in 2023 (AB113) and in committee in 2025 (SB82).</w:t>
+      </w:r>
+    </w:p>
+    <w:p>
+      <w:pPr>
+        <w:spacing w:before="0" w:after="64" w:lineRule="auto" w:line="250"/>
+        <w:jc w:val="both"/>
+      </w:pPr>
+      <w:r>
+        <w:rPr>
+          <w:rFonts w:ascii="Arial" w:hAnsi="Arial" w:cs="Arial" w:eastAsia="Arial"/>
+          <w:b/>
+          <w:color w:val="1A2D4F"/>
+          <w:sz w:val="17"/>
+        </w:rPr>
+        <w:t>Never filed at all.</w:t>
+      </w:r>
+      <w:r>
+        <w:rPr>
+          <w:rFonts w:ascii="Arial" w:hAnsi="Arial" w:cs="Arial" w:eastAsia="Arial"/>
+          <w:b w:val="0"/>
+          <w:color w:val="444444"/>
+          <w:sz w:val="17"/>
+        </w:rPr>
+        <w:t xml:space="preserve"> No bill requires independent proof of learning benefit before districts buy classroom technology or limits early-grade screen time — the nearest transparency bill, SB248 (2025), died in Senate Education, and the ed-tech commission was abolished in 2023 (SB214). No bill proposes pre-K for all children or touches superintendent pay; the $485,000 contracts are signed by elected boards. The three-cueing instruction ban (AB187, 2023) died in committee, as did the bills making counselor staffing unconditional (AB298, 2025) and mandating monthly mental-health workshops (AB374, 2025).</w:t>
+      </w:r>
+    </w:p>
+    <w:p>
+      <w:pPr>
+        <w:spacing w:before="100" w:after="50" w:lineRule="auto" w:line="254"/>
       </w:pPr>
       <w:r>
         <w:rPr>
@@ -672,12 +815,99 @@
           <w:sz w:val="21"/>
           <w:spacing w:val="20"/>
         </w:rPr>
-        <w:t>NEW LAW FROM THE 2025 SESSION</w:t>
+        <w:t>MOMENTUM MAP: ACTIVE FRONTS AND QUIET FRONTS</w:t>
       </w:r>
     </w:p>
     <w:p>
       <w:pPr>
-        <w:spacing w:before="0" w:after="80" w:lineRule="auto" w:line="254"/>
+        <w:spacing w:before="0" w:after="50" w:lineRule="auto" w:line="250"/>
+      </w:pPr>
+      <w:r>
+        <w:rPr>
+          <w:rFonts w:ascii="Arial" w:hAnsi="Arial" w:cs="Arial" w:eastAsia="Arial"/>
+          <w:b w:val="0"/>
+          <w:i/>
+          <w:color w:val="666666"/>
+          <w:sz w:val="15"/>
+        </w:rPr>
+        <w:t>Where bills keep appearing and advancing — and where the Legislature has not yet shown willingness to legislate.</w:t>
+      </w:r>
+    </w:p>
+    <w:p>
+      <w:pPr>
+        <w:spacing w:before="0" w:after="64" w:lineRule="auto" w:line="250"/>
+        <w:jc w:val="both"/>
+      </w:pPr>
+      <w:r>
+        <w:rPr>
+          <w:rFonts w:ascii="Arial" w:hAnsi="Arial" w:cs="Arial" w:eastAsia="Arial"/>
+          <w:b/>
+          <w:color w:val="1A2D4F"/>
+          <w:sz w:val="17"/>
+        </w:rPr>
+        <w:t>Active:</w:t>
+      </w:r>
+      <w:r>
+        <w:rPr>
+          <w:rFonts w:ascii="Arial" w:hAnsi="Arial" w:cs="Arial" w:eastAsia="Arial"/>
+          <w:b w:val="0"/>
+          <w:color w:val="444444"/>
+          <w:sz w:val="17"/>
+        </w:rPr>
+        <w:t xml:space="preserve"> teacher pay and pipeline (funded or eased every recent session); administrator accountability (two laws and a new oversight board); funding and facilities (formula rebuilt, mining tax added, $100 million bonded); measurement trimming (test time capped, finals ended, trigger consolidated); mental-health staffing frameworks (SB319 of 2019, 41–0 and 21–0; SB151 of 2021; SB277 of 2025). </w:t>
+      </w:r>
+      <w:r>
+        <w:rPr>
+          <w:rFonts w:ascii="Arial" w:hAnsi="Arial" w:cs="Arial" w:eastAsia="Arial"/>
+          <w:b/>
+          <w:color w:val="1A2D4F"/>
+          <w:sz w:val="17"/>
+        </w:rPr>
+        <w:t>Quiet:</w:t>
+      </w:r>
+      <w:r>
+        <w:rPr>
+          <w:rFonts w:ascii="Arial" w:hAnsi="Arial" w:cs="Arial" w:eastAsia="Arial"/>
+          <w:b w:val="0"/>
+          <w:color w:val="444444"/>
+          <w:sz w:val="17"/>
+        </w:rPr>
+        <w:t xml:space="preserve"> the outside-audit design (seven bills, no vote yet); recess and instructional-minute mandates; superintendent pay (never touched by any bill); universal pre-K as an entitlement; ed-tech purchasing standards (never filed); and the unconditional versions of staffing mandates, which die in committee while the money-permitting versions pass.</w:t>
+      </w:r>
+    </w:p>
+    <w:p>
+      <w:pPr>
+        <w:spacing w:before="100" w:after="50" w:lineRule="auto" w:line="254"/>
+      </w:pPr>
+      <w:r>
+        <w:rPr>
+          <w:rFonts w:ascii="Arial" w:hAnsi="Arial" w:cs="Arial" w:eastAsia="Arial"/>
+          <w:b/>
+          <w:color w:val="C0392B"/>
+          <w:sz w:val="21"/>
+          <w:spacing w:val="20"/>
+        </w:rPr>
+        <w:t>FEDERAL OVERLAP: WHAT IS ALREADY ADDRESSED OUTSIDE CARSON CITY</w:t>
+      </w:r>
+    </w:p>
+    <w:p>
+      <w:pPr>
+        <w:spacing w:before="0" w:after="50" w:lineRule="auto" w:line="250"/>
+      </w:pPr>
+      <w:r>
+        <w:rPr>
+          <w:rFonts w:ascii="Arial" w:hAnsi="Arial" w:cs="Arial" w:eastAsia="Arial"/>
+          <w:b w:val="0"/>
+          <w:i/>
+          <w:color w:val="666666"/>
+          <w:sz w:val="15"/>
+        </w:rPr>
+        <w:t>Where federal action already covers ground, a state bill duplicates it — or collides with it; where none exists, the state route is the only one.</w:t>
+      </w:r>
+    </w:p>
+    <w:p>
+      <w:pPr>
+        <w:spacing w:before="0" w:after="64" w:lineRule="auto" w:line="250"/>
         <w:jc w:val="both"/>
       </w:pPr>
       <w:r>
@@ -685,9 +915,54 @@
           <w:rFonts w:ascii="Arial" w:hAnsi="Arial" w:cs="Arial" w:eastAsia="Arial"/>
           <w:b w:val="0"/>
           <w:color w:val="444444"/>
-          <w:sz w:val="18"/>
+          <w:sz w:val="17"/>
         </w:rPr>
-        <w:t>The 2025 session funded hard-to-fill teacher pay (AB398) and let out-of-state teachers start work provisionally (AB49, 42–0 and 21–0). It created principal consequences and a Public Education Oversight Board (SB460), made the statewide assessment the sole Read by Grade 3 trigger (SB278), required district cellphone policies (SB444), banned AI from counselor duties (AB406), and added school social workers where money allows (SB277). It bonded $100 million for emergency school repairs (AB224, 41–1 and 21–0), opened cross-zone transfers with transportation grants (AB533), and passed the biennium funding act (SB500) 42–0 in the Assembly and 13–8 in the Senate.</w:t>
+        <w:t>The federal Every Student Succeeds Act requires annual statewide testing in grades 3–8 and once in high school — dropping the statewide assessment would collide with it — but ESSA allows growth-based accountability, so designs like SB351 are federally permitted. Districts that spend federal money already undergo annual federal single audits, which the outside-IG proposals would extend rather than duplicate. Pupil-data privacy is federally covered (FERPA and COPPA — the ground SB403 of 2019 built on); no federal rule sets an efficacy standard for classroom-technology purchases. Head Start is the federal pre-K program for low-income families; universal federal pre-K has been proposed, never enacted. There is no federal recess, class-size, or teacher-salary mandate — congressional minimum-salary proposals have not passed — though federal loan-forgiveness programs for teachers already exist.</w:t>
+      </w:r>
+    </w:p>
+    <w:p>
+      <w:pPr>
+        <w:spacing w:before="100" w:after="50" w:lineRule="auto" w:line="254"/>
+      </w:pPr>
+      <w:r>
+        <w:rPr>
+          <w:rFonts w:ascii="Arial" w:hAnsi="Arial" w:cs="Arial" w:eastAsia="Arial"/>
+          <w:b/>
+          <w:color w:val="C0392B"/>
+          <w:sz w:val="21"/>
+          <w:spacing w:val="20"/>
+        </w:rPr>
+        <w:t>SPONSORS, COMMITTEES, AND WHO STILL SERVES</w:t>
+      </w:r>
+    </w:p>
+    <w:p>
+      <w:pPr>
+        <w:spacing w:before="0" w:after="50" w:lineRule="auto" w:line="250"/>
+      </w:pPr>
+      <w:r>
+        <w:rPr>
+          <w:rFonts w:ascii="Arial" w:hAnsi="Arial" w:cs="Arial" w:eastAsia="Arial"/>
+          <w:b w:val="0"/>
+          <w:i/>
+          <w:color w:val="666666"/>
+          <w:sz w:val="15"/>
+        </w:rPr>
+        <w:t>Who has carried these bills, where bills stop, and which authors remain in the Legislature.</w:t>
+      </w:r>
+    </w:p>
+    <w:p>
+      <w:pPr>
+        <w:spacing w:before="0" w:after="64" w:lineRule="auto" w:line="250"/>
+        <w:jc w:val="both"/>
+      </w:pPr>
+      <w:r>
+        <w:rPr>
+          <w:rFonts w:ascii="Arial" w:hAnsi="Arial" w:cs="Arial" w:eastAsia="Arial"/>
+          <w:b w:val="0"/>
+          <w:color w:val="444444"/>
+          <w:sz w:val="17"/>
+        </w:rPr>
+        <w:t>Senate Education members of both parties carry the heaviest loads, most still in office: Senator Marilyn Dondero Loop (D), the most frequent primary sponsor (37 bills), and Senator Carrie Buck (R, 31) are current members; Senator Scott Hammond (R, 31, mostly choice bills that died in committee) left after 2023. Assemblymembers Brittney Miller (D, the auditor file) and Selena Torres-Fossett (D, the teacher pipeline) still serve, as do Senators Roberta Lange (D) and Lisa Krasner (R), the measurement team. The chokepoints: Education committees stopped 127 bills at the first stop, the money committees 40 — mostly bills with price tags — Government Affairs 12, including most inspector-general designs.</w:t>
       </w:r>
     </w:p>
     <w:p>

</xml_diff>